<commit_message>
Add Technical Guide v2.0 and RUSLE2 factor-ratio chart
Update v1.9 guide (graphics-preserving zip edit) and add the new v2.0
guide plus the RUSLE2 factor-ratio chart supporting §7.7 validation.

Co-Authored-By: Claude Opus 4.8 <noreply@anthropic.com>
</commit_message>
<xml_diff>
--- a/CoverMap_Technical_Guide_v1.9.docx
+++ b/CoverMap_Technical_Guide_v1.9.docx
@@ -262,7 +262,6 @@
         <w:jc w:val="center"/>
         <w:rPr/>
       </w:pPr>
-      <w:r/>
       <w:r>
         <mc:AlternateContent>
           <mc:Choice Requires="wpg">
@@ -332,21 +331,6 @@
           </mc:Fallback>
         </mc:AlternateContent>
       </w:r>
-      <w:r/>
-      <w:r/>
-      <w:r/>
-      <w:r/>
-      <w:r/>
-      <w:r/>
-      <w:r/>
-      <w:r/>
-      <w:r/>
-      <w:r/>
-      <w:r/>
-      <w:r/>
-      <w:r/>
-      <w:r/>
-      <w:r/>
       <w:r/>
     </w:p>
     <w:p>
@@ -7593,7 +7577,16 @@
                 <w:sz w:val="18"/>
                 <w:szCs w:val="18"/>
               </w:rPr>
-              <w:t xml:space="preserve">intersecting the field boundary, weighted by each map unit’s area fraction (a 105-acre field with Monona 65%, Judson 20%, Ida 7% now blends all three). The dominant-component WSS value is retained only as a fallback when SDA is unavailable. Remaining limitation: this area-weighted K is still applied as a single field-level value, not distributed per pixel, so it cannot localize higher K to the steeper Ida slope units.</w:t>
+              <w:t xml:space="preserve">intersecting the field boundary, weighted by each map unit’s area fraction (a 105-acre field with Monona 65%, Judson 20%, Ida 7% now blends all three). The dominant-</w:t>
+            </w:r>
+            <w:r>
+              <w:rPr>
+                <w:rFonts w:ascii="Arial" w:hAnsi="Arial" w:eastAsia="Arial" w:cs="Arial"/>
+                <w:color w:val="1e40af"/>
+                <w:sz w:val="18"/>
+                <w:szCs w:val="18"/>
+              </w:rPr>
+              <w:t xml:space="preserve">component WSS value is retained only as a fallback when SDA is unavailable. Remaining limitation: this area-weighted K is still applied as a single field-level value, not distributed per pixel, so it cannot localize higher K to the steeper Ida slope units.</w:t>
             </w:r>
             <w:r/>
           </w:p>
@@ -7650,7 +7643,23 @@
           <w:sz w:val="20"/>
           <w:szCs w:val="20"/>
         </w:rPr>
-        <w:t xml:space="preserve"> If a field falls outside the bundled coverage, CoverMap falls back to R=150 and flags the value for manual verification. The FCC Census Block API is still queried, but only to label the report with the field’s county and state — it no longer determines R. CoverMap intentionally retains the AH703/1997 erosivity so its estimates stay consistent with RUSLE2 — the NRCS conservation-planning benchmark CoverMap is validated against; a 2022 erosivity update (~30% higher, partly from including small storm events) is under evaluation pending that validation.</w:t>
+        <w:t xml:space="preserve"> If a field falls outside the bundled covera</w:t>
+      </w:r>
+      <w:r>
+        <w:rPr>
+          <w:rFonts w:ascii="Arial" w:hAnsi="Arial" w:eastAsia="Arial" w:cs="Arial"/>
+          <w:sz w:val="20"/>
+          <w:szCs w:val="20"/>
+        </w:rPr>
+        <w:t xml:space="preserve">ge, CoverMap falls back to R=150 and flags the value for manual verification. The FCC Census Block API is still queried, but only to label the report with the field’s county and state — it no longer determines R. CoverMap intentionally retains the AH703/19</w:t>
+      </w:r>
+      <w:r>
+        <w:rPr>
+          <w:rFonts w:ascii="Arial" w:hAnsi="Arial" w:eastAsia="Arial" w:cs="Arial"/>
+          <w:sz w:val="20"/>
+          <w:szCs w:val="20"/>
+        </w:rPr>
+        <w:t xml:space="preserve">97 erosivity so its estimates stay consistent with RUSLE2 — the NRCS conservation-planning benchmark CoverMap is validated against; a 2022 erosivity update (~30% higher, partly from including small storm events) is under evaluation pending that validation.</w:t>
       </w:r>
       <w:r/>
     </w:p>
@@ -16255,7 +16264,34 @@
                 <w:sz w:val="22"/>
                 <w:szCs w:val="22"/>
               </w:rPr>
-              <w:t xml:space="preserve">A = estimated annual soil loss (tons/acre/year)    │    P = 1.0 assumed (no practice factor)</w:t>
+              <w:t xml:space="preserve">A = estimated annual soil loss (tons/acre/year)    │    </w:t>
+            </w:r>
+            <w:commentRangeStart w:id="0"/>
+            <w:r>
+              <w:rPr>
+                <w:rFonts w:ascii="Courier New" w:hAnsi="Courier New" w:eastAsia="Courier New" w:cs="Courier New"/>
+                <w:b/>
+                <w:bCs/>
+                <w:color w:val="1f4e79"/>
+                <w:sz w:val="22"/>
+                <w:szCs w:val="22"/>
+              </w:rPr>
+              <w:t xml:space="preserve">P</w:t>
+            </w:r>
+            <w:commentRangeEnd w:id="0"/>
+            <w:r>
+              <w:commentReference w:id="0"/>
+            </w:r>
+            <w:r>
+              <w:rPr>
+                <w:rFonts w:ascii="Courier New" w:hAnsi="Courier New" w:eastAsia="Courier New" w:cs="Courier New"/>
+                <w:b/>
+                <w:bCs/>
+                <w:color w:val="1f4e79"/>
+                <w:sz w:val="22"/>
+                <w:szCs w:val="22"/>
+              </w:rPr>
+              <w:t xml:space="preserve"> = 1.0 assumed (no practice factor)</w:t>
             </w:r>
             <w:r/>
           </w:p>
@@ -18331,6 +18367,15 @@
           <w:szCs w:val="20"/>
         </w:rPr>
       </w:r>
+      <w:r>
+        <w:rPr>
+          <w:rFonts w:ascii="Arial" w:hAnsi="Arial" w:eastAsia="Arial" w:cs="Arial"/>
+          <w:b/>
+          <w:bCs/>
+          <w:sz w:val="20"/>
+          <w:szCs w:val="20"/>
+        </w:rPr>
+      </w:r>
     </w:p>
     <w:p>
       <w:pPr>
@@ -19284,7 +19329,7 @@
           <w:sz w:val="24"/>
           <w:szCs w:val="24"/>
         </w:rPr>
-        <w:t xml:space="preserve">7.6 Producer Report Output — Erosion Reduction Summary</w:t>
+        <w:t xml:space="preserve">7.4 Producer Report Output — Erosion Reduction Summary</w:t>
       </w:r>
       <w:r/>
     </w:p>
@@ -19905,8 +19950,26 @@
           <w:sz w:val="24"/>
           <w:szCs w:val="24"/>
         </w:rPr>
-        <w:t xml:space="preserve">7.5 Cover Crop Erosion Reduction </w:t>
+        <w:t xml:space="preserve">7.5 Cover Crop Erosion </w:t>
       </w:r>
+      <w:commentRangeStart w:id="1"/>
+      <w:r>
+        <w:rPr>
+          <w:rFonts w:ascii="Arial" w:hAnsi="Arial" w:eastAsia="Arial" w:cs="Arial"/>
+          <w:b/>
+          <w:bCs/>
+          <w:color w:val="2e75b6"/>
+          <w:sz w:val="24"/>
+          <w:szCs w:val="24"/>
+        </w:rPr>
+        <w:t xml:space="preserve">Reduction </w:t>
+      </w:r>
+      <w:r/>
+      <w:commentRangeEnd w:id="1"/>
+      <w:r>
+        <w:commentReference w:id="1"/>
+      </w:r>
+      <w:r/>
       <w:r/>
     </w:p>
     <w:p>
@@ -26816,6 +26879,17 @@
           <w:lang w:val="en-US"/>
         </w:rPr>
         <w:t xml:space="preserve">ut</w:t>
+      </w:r>
+      <w:r>
+        <w:rPr>
+          <w:rFonts w:ascii="Arial" w:hAnsi="Arial" w:eastAsia="Arial" w:cs="Arial"/>
+          <w:b/>
+          <w:bCs/>
+          <w:color w:val="2e75b6"/>
+          <w:sz w:val="24"/>
+          <w:szCs w:val="24"/>
+          <w:lang w:val="en-US"/>
+        </w:rPr>
       </w:r>
       <w:r>
         <w:rPr>
@@ -26952,6 +27026,11 @@
           <w:highlight w:val="none"/>
         </w:rPr>
       </w:r>
+      <w:r>
+        <w:rPr>
+          <w:highlight w:val="none"/>
+        </w:rPr>
+      </w:r>
     </w:p>
     <w:p>
       <w:pPr>
@@ -27515,6 +27594,64 @@
 </w:document>
 </file>
 
+<file path=word/comments.xml><?xml version="1.0" encoding="utf-8"?>
+<w:comments xmlns:wpc="http://schemas.microsoft.com/office/word/2010/wordprocessingCanvas" xmlns:mc="http://schemas.openxmlformats.org/markup-compatibility/2006" xmlns:o="urn:schemas-microsoft-com:office:office" xmlns:r="http://schemas.openxmlformats.org/officeDocument/2006/relationships" xmlns:m="http://schemas.openxmlformats.org/officeDocument/2006/math" xmlns:v="urn:schemas-microsoft-com:vml" xmlns:wp14="http://schemas.microsoft.com/office/word/2010/wordprocessingDrawing" xmlns:wp="http://schemas.openxmlformats.org/drawingml/2006/wordprocessingDrawing" xmlns:w10="urn:schemas-microsoft-com:office:word" xmlns:w="http://schemas.openxmlformats.org/wordprocessingml/2006/main" xmlns:w14="http://schemas.microsoft.com/office/word/2010/wordml" xmlns:w15="http://schemas.microsoft.com/office/word/2012/wordml" xmlns:wpg="http://schemas.microsoft.com/office/word/2010/wordprocessingGroup" xmlns:wpi="http://schemas.microsoft.com/office/word/2010/wordprocessingInk" xmlns:wne="http://schemas.microsoft.com/office/word/2006/wordml" xmlns:wps="http://schemas.microsoft.com/office/word/2010/wordprocessingShape" mc:Ignorable="w14 w15 wp14">
+  <w:comment w:id="0" w:author="User" w:date="2026-06-21T05:50:39Z" w:initials="U">
+    <w:p>
+      <w:pPr>
+        <w:spacing w:line="240" w:after="0" w:lineRule="auto" w:before="0"/>
+        <w:ind w:firstLine="0" w:left="0" w:right="0"/>
+        <w:jc w:val="left"/>
+      </w:pPr>
+      <w:r>
+        <w:rPr>
+          <w:rFonts w:eastAsia="Arial" w:ascii="Arial" w:hAnsi="Arial" w:cs="Arial"/>
+          <w:sz w:val="22"/>
+        </w:rPr>
+        <w:t xml:space="preserve">Should we assume terraces? reduce P?</w:t>
+      </w:r>
+    </w:p>
+  </w:comment>
+  <w:comment w:id="1" w:author="User" w:date="2026-06-21T05:50:07Z" w:initials="U">
+    <w:p>
+      <w:pPr>
+        <w:spacing w:line="240" w:after="0" w:lineRule="auto" w:before="0"/>
+        <w:ind w:firstLine="0" w:left="0" w:right="0"/>
+        <w:jc w:val="left"/>
+      </w:pPr>
+      <w:r>
+        <w:rPr>
+          <w:rFonts w:eastAsia="Arial" w:ascii="Arial" w:hAnsi="Arial" w:cs="Arial"/>
+          <w:sz w:val="22"/>
+        </w:rPr>
+        <w:t xml:space="preserve">add table of zone by T?</w:t>
+      </w:r>
+    </w:p>
+  </w:comment>
+</w:comments>
+</file>
+
+<file path=word/commentsExtended.xml><?xml version="1.0" encoding="utf-8"?>
+<w15:commentsEx xmlns:wpc="http://schemas.microsoft.com/office/word/2010/wordprocessingCanvas" xmlns:mc="http://schemas.openxmlformats.org/markup-compatibility/2006" xmlns:o="urn:schemas-microsoft-com:office:office" xmlns:r="http://schemas.openxmlformats.org/officeDocument/2006/relationships" xmlns:m="http://schemas.openxmlformats.org/officeDocument/2006/math" xmlns:v="urn:schemas-microsoft-com:vml" xmlns:wp14="http://schemas.microsoft.com/office/word/2010/wordprocessingDrawing" xmlns:wp="http://schemas.openxmlformats.org/drawingml/2006/wordprocessingDrawing" xmlns:w10="urn:schemas-microsoft-com:office:word" xmlns:w="http://schemas.openxmlformats.org/wordprocessingml/2006/main" xmlns:w14="http://schemas.microsoft.com/office/word/2010/wordml" xmlns:w15="http://schemas.microsoft.com/office/word/2012/wordml" xmlns:wpg="http://schemas.microsoft.com/office/word/2010/wordprocessingGroup" xmlns:wpi="http://schemas.microsoft.com/office/word/2010/wordprocessingInk" xmlns:wne="http://schemas.microsoft.com/office/word/2006/wordml" xmlns:wps="http://schemas.microsoft.com/office/word/2010/wordprocessingShape" mc:Ignorable="w14 w15 wp14">
+  <w15:commentEx w15:paraId="00000001" w15:done="0"/>
+  <w15:commentEx w15:paraId="00000002" w15:done="0"/>
+</w15:commentsEx>
+</file>
+
+<file path=word/commentsExtensible.xml><?xml version="1.0" encoding="utf-8"?>
+<w16cex:commentsExtensible xmlns:wpc="http://schemas.microsoft.com/office/word/2010/wordprocessingCanvas" xmlns:cx="http://schemas.microsoft.com/office/drawing/2014/chartex" xmlns:cx1="http://schemas.microsoft.com/office/drawing/2015/9/8/chartex" xmlns:cx2="http://schemas.microsoft.com/office/drawing/2015/10/21/chartex" xmlns:cx3="http://schemas.microsoft.com/office/drawing/2016/5/9/chartex" xmlns:cx4="http://schemas.microsoft.com/office/drawing/2016/5/10/chartex" xmlns:cx5="http://schemas.microsoft.com/office/drawing/2016/5/11/chartex" xmlns:cx6="http://schemas.microsoft.com/office/drawing/2016/5/12/chartex" xmlns:cx7="http://schemas.microsoft.com/office/drawing/2016/5/13/chartex" xmlns:cx8="http://schemas.microsoft.com/office/drawing/2016/5/14/chartex" xmlns:mc="http://schemas.openxmlformats.org/markup-compatibility/2006" xmlns:aink="http://schemas.microsoft.com/office/drawing/2016/ink" xmlns:am3d="http://schemas.microsoft.com/office/drawing/2017/model3d" xmlns:o="urn:schemas-microsoft-com:office:office" xmlns:r="http://schemas.openxmlformats.org/officeDocument/2006/relationships" xmlns:m="http://schemas.openxmlformats.org/officeDocument/2006/math" xmlns:v="urn:schemas-microsoft-com:vml" xmlns:wp14="http://schemas.microsoft.com/office/word/2010/wordprocessingDrawing" xmlns:wp="http://schemas.openxmlformats.org/drawingml/2006/wordprocessingDrawing" xmlns:w10="urn:schemas-microsoft-com:office:word" xmlns:w="http://schemas.openxmlformats.org/wordprocessingml/2006/main" xmlns:w14="http://schemas.microsoft.com/office/word/2010/wordml" xmlns:w15="http://schemas.microsoft.com/office/word/2012/wordml" xmlns:w16cex="http://schemas.microsoft.com/office/word/2018/wordml/cex" xmlns:w16cid="http://schemas.microsoft.com/office/word/2016/wordml/cid" xmlns:w16="http://schemas.microsoft.com/office/word/2018/wordml" xmlns:w16se="http://schemas.microsoft.com/office/word/2015/wordml/symex" xmlns:wpg="http://schemas.microsoft.com/office/word/2010/wordprocessingGroup" xmlns:wpi="http://schemas.microsoft.com/office/word/2010/wordprocessingInk" xmlns:wne="http://schemas.microsoft.com/office/word/2006/wordml" xmlns:wps="http://schemas.microsoft.com/office/word/2010/wordprocessingShape" mc:Ignorable="w14 w15 w16se w16cid w16 w16cex wp14">
+  <w16cex:commentExtensible w16cex:durableId="33B01AE2" w16cex:dateUtc="2026-06-21T10:50:39Z"/>
+  <w16cex:commentExtensible w16cex:durableId="385BB9AB" w16cex:dateUtc="2026-06-21T10:50:07Z"/>
+</w16cex:commentsExtensible>
+</file>
+
+<file path=word/commentsIds.xml><?xml version="1.0" encoding="utf-8"?>
+<w16cid:commentsIds xmlns:mc="http://schemas.openxmlformats.org/markup-compatibility/2006" xmlns:w16cid="http://schemas.microsoft.com/office/word/2016/wordml/cid" mc:Ignorable="w16cid">
+  <w16cid:commentId w16cid:paraId="00000001" w16cid:durableId="33B01AE2"/>
+  <w16cid:commentId w16cid:paraId="00000002" w16cid:durableId="385BB9AB"/>
+</w16cid:commentsIds>
+</file>
+
 <file path=word/endnotes.xml><?xml version="1.0" encoding="utf-8"?>
 <w:endnotes xmlns:wpc="http://schemas.microsoft.com/office/word/2010/wordprocessingCanvas" xmlns:mc="http://schemas.openxmlformats.org/markup-compatibility/2006" xmlns:o="urn:schemas-microsoft-com:office:office" xmlns:r="http://schemas.openxmlformats.org/officeDocument/2006/relationships" xmlns:m="http://schemas.openxmlformats.org/officeDocument/2006/math" xmlns:v="urn:schemas-microsoft-com:vml" xmlns:wp14="http://schemas.microsoft.com/office/word/2010/wordprocessingDrawing" xmlns:wp="http://schemas.openxmlformats.org/drawingml/2006/wordprocessingDrawing" xmlns:w10="urn:schemas-microsoft-com:office:word" xmlns:w="http://schemas.openxmlformats.org/wordprocessingml/2006/main" xmlns:w14="http://schemas.microsoft.com/office/word/2010/wordml" xmlns:w15="http://schemas.microsoft.com/office/word/2012/wordml" xmlns:wpg="http://schemas.microsoft.com/office/word/2010/wordprocessingGroup" xmlns:wpi="http://schemas.microsoft.com/office/word/2010/wordprocessingInk" xmlns:wne="http://schemas.microsoft.com/office/word/2006/wordml" xmlns:a="http://schemas.openxmlformats.org/drawingml/2006/main" xmlns:wps="http://schemas.microsoft.com/office/word/2010/wordprocessingShape" mc:Ignorable="w14 w15 wp14">
   <w:endnote w:type="separator" w:id="-1">
@@ -27940,6 +28077,14 @@
     <w:abstractNumId w:val="1"/>
   </w:num>
 </w:numbering>
+</file>
+
+<file path=word/people.xml><?xml version="1.0" encoding="utf-8"?>
+<w15:people xmlns:wpc="http://schemas.microsoft.com/office/word/2010/wordprocessingCanvas" xmlns:mc="http://schemas.openxmlformats.org/markup-compatibility/2006" xmlns:o="urn:schemas-microsoft-com:office:office" xmlns:r="http://schemas.openxmlformats.org/officeDocument/2006/relationships" xmlns:m="http://schemas.openxmlformats.org/officeDocument/2006/math" xmlns:v="urn:schemas-microsoft-com:vml" xmlns:wp14="http://schemas.microsoft.com/office/word/2010/wordprocessingDrawing" xmlns:wp="http://schemas.openxmlformats.org/drawingml/2006/wordprocessingDrawing" xmlns:w10="urn:schemas-microsoft-com:office:word" xmlns:w="http://schemas.openxmlformats.org/wordprocessingml/2006/main" xmlns:w14="http://schemas.microsoft.com/office/word/2010/wordml" xmlns:w15="http://schemas.microsoft.com/office/word/2012/wordml" xmlns:wpg="http://schemas.microsoft.com/office/word/2010/wordprocessingGroup" xmlns:wpi="http://schemas.microsoft.com/office/word/2010/wordprocessingInk" xmlns:wne="http://schemas.microsoft.com/office/word/2006/wordml" xmlns:wps="http://schemas.microsoft.com/office/word/2010/wordprocessingShape" mc:Ignorable="w14 w15 wp14">
+  <w15:person w15:author="User">
+    <w15:presenceInfo w15:providerId="Teamlab" w15:userId="User"/>
+  </w15:person>
+</w15:people>
 </file>
 
 <file path=word/styles.xml><?xml version="1.0" encoding="utf-8"?>

</xml_diff>